<commit_message>
Two-day dates, Allocations Matrix, clickable download cards, secretariat pyramid, Mridula photo, gesyc26 email
Co-Authored-By: Claude Fable 5 <noreply@anthropic.com>
</commit_message>
<xml_diff>
--- a/STUFF/LINKS.docx
+++ b/STUFF/LINKS.docx
@@ -10,15 +10,6 @@
         <w:br/>
       </w:r>
       <w:hyperlink r:id="rId4">
-        <w:r>
-          <w:rPr>
-            <w:color w:val="0000EE"/>
-            <w:u w:val="single"/>
-          </w:rPr>
-          <w:t>COUNTRY MATRIX</w:t>
-        </w:r>
-      </w:hyperlink>
-      <w:hyperlink r:id="rId5">
         <w:r>
           <w:rPr>
             <w:color w:val="1155CC"/>
@@ -37,7 +28,7 @@
       <w:r>
         <w:br/>
       </w:r>
-      <w:hyperlink r:id="rId6">
+      <w:hyperlink r:id="rId5">
         <w:r>
           <w:rPr>
             <w:color w:val="1155CC"/>
@@ -56,7 +47,7 @@
       <w:r>
         <w:br/>
       </w:r>
-      <w:hyperlink r:id="rId7">
+      <w:hyperlink r:id="rId6">
         <w:r>
           <w:rPr>
             <w:color w:val="1155CC"/>
@@ -75,7 +66,7 @@
       </w:r>
     </w:p>
     <w:p>
-      <w:hyperlink r:id="rId8" w:history="1">
+      <w:hyperlink r:id="rId7" w:history="1">
         <w:r>
           <w:rPr>
             <w:rStyle w:val="Hyperlink"/>

</xml_diff>

<commit_message>
Postpone GESYC '26 to 30 & 31 October 2026
Co-Authored-By: Claude Fable 5 <noreply@anthropic.com>
</commit_message>
<xml_diff>
--- a/STUFF/LINKS.docx
+++ b/STUFF/LINKS.docx
@@ -112,19 +112,7 @@
           <w:rPr>
             <w:rStyle w:val="Hyperlink"/>
           </w:rPr>
-          <w:t>https://drive.google.com/file/d/12gu37tOlxrNmh1vy6ISNaEz4YyqSB9Y7/view?usp=dri</w:t>
-        </w:r>
-        <w:r>
-          <w:rPr>
-            <w:rStyle w:val="Hyperlink"/>
-          </w:rPr>
-          <w:t>v</w:t>
-        </w:r>
-        <w:r>
-          <w:rPr>
-            <w:rStyle w:val="Hyperlink"/>
-          </w:rPr>
-          <w:t>e_link</w:t>
+          <w:t>https://drive.google.com/file/d/12gu37tOlxrNmh1vy6ISNaEz4YyqSB9Y7/view?usp=drive_link</w:t>
         </w:r>
       </w:hyperlink>
     </w:p>
@@ -141,6 +129,39 @@
             <w:rStyle w:val="Hyperlink"/>
           </w:rPr>
           <w:t>https://drive.google.com/file/d/1h9pkENMKoxNcF0Mmug0HnVRtyW0HkpBL/view?usp=drive_link</w:t>
+        </w:r>
+      </w:hyperlink>
+      <w:r>
+        <w:br/>
+      </w:r>
+      <w:r>
+        <w:br/>
+        <w:t>FORUM SALUTIS:</w:t>
+      </w:r>
+    </w:p>
+    <w:p>
+      <w:hyperlink r:id="rId10" w:history="1">
+        <w:r>
+          <w:rPr>
+            <w:rStyle w:val="Hyperlink"/>
+          </w:rPr>
+          <w:t>https://drive.google.com/file/d/1IE7CsVd9kQsOZubHbIA2Wmi50BvIutoy/view?usp=drive_link</w:t>
+        </w:r>
+      </w:hyperlink>
+    </w:p>
+    <w:p/>
+    <w:p>
+      <w:r>
+        <w:t>FORUM VERITAS:</w:t>
+      </w:r>
+    </w:p>
+    <w:p>
+      <w:hyperlink r:id="rId11" w:history="1">
+        <w:r>
+          <w:rPr>
+            <w:rStyle w:val="Hyperlink"/>
+          </w:rPr>
+          <w:t>https://drive.google.com/file/d/18jlgOAfOrw5HusZxMjaLv3485dgNbVxY/view?usp=sharing</w:t>
         </w:r>
       </w:hyperlink>
     </w:p>

</xml_diff>